<commit_message>
update README and agent documentation for SynapsEd
Revise the README to clarify the purpose and capabilities of SynapsEd, enhancing navigation and structure. Add links to relevant documentation and quick start guides. Update the agent README to include navigation links and improve clarity on the core architecture. Additionally, enhance the study README with new sections for research evaluation and setup instructions, ensuring better accessibility for users.
</commit_message>
<xml_diff>
--- a/study/report_os_datastructures.docx
+++ b/study/report_os_datastructures.docx
@@ -2242,7 +2242,7 @@
           <w:rFonts w:ascii="Times New Roman" w:hAnsi="Times New Roman" w:eastAsia="Times New Roman"/>
           <w:sz w:val="26"/>
         </w:rPr>
-        <w:t>We wrote three automated checks in plain code, no AI model involved, to verify every one of the 30 pathways per course actually follows the rules above.</w:t>
+        <w:t>Section 3 set three rules for what a personalized required-course pathway must do: the destination is fixed, the route is personalized, and the budget stays the same. We wrote three automated checks in plain code, no AI model involved, one for each rule, to verify every one of the 30 pathways per course actually follows them.</w:t>
       </w:r>
     </w:p>
     <w:p>
@@ -2255,14 +2255,14 @@
           <w:b/>
           <w:sz w:val="26"/>
         </w:rPr>
-        <w:t>The coverage floor check.</w:t>
+        <w:t>The coverage floor check</w:t>
       </w:r>
       <w:r>
         <w:rPr>
           <w:rFonts w:ascii="Times New Roman" w:hAnsi="Times New Roman" w:eastAsia="Times New Roman"/>
           <w:sz w:val="26"/>
         </w:rPr>
-        <w:t xml:space="preserve"> Does every block appear in every pathway, at or above the minimum count we calculated for it? This is a pass-or-fail check, not a personalization measurement. A required course fails immediately if any student's pathway drops a block below its floor.</w:t>
+        <w:t>, for the destination-is-fixed rule. Does every block appear in every pathway, at or above the minimum count we calculated for it? This is a pass-or-fail check, not a personalization measurement. A required course fails immediately if any student's pathway drops a block below its floor.</w:t>
       </w:r>
     </w:p>
     <w:p>
@@ -2275,14 +2275,14 @@
           <w:b/>
           <w:sz w:val="26"/>
         </w:rPr>
-        <w:t>The role-mix check.</w:t>
+        <w:t>The role-mix check</w:t>
       </w:r>
       <w:r>
         <w:rPr>
           <w:rFonts w:ascii="Times New Roman" w:hAnsi="Times New Roman" w:eastAsia="Times New Roman"/>
           <w:sz w:val="26"/>
         </w:rPr>
-        <w:t xml:space="preserve"> Does the number of scaffolding_catchup nodes in the foundational block go down as a student's tier goes up, across all 30 profiles, not just the 2 or 3 we might eyeball by hand?</w:t>
+        <w:t>, for the route-is-personalized rule. Does the number of scaffolding_catchup nodes in the foundational block go down as a student's tier goes up, across all 30 profiles, not just the 2 or 3 we might eyeball by hand?</w:t>
       </w:r>
     </w:p>
     <w:p>
@@ -2295,14 +2295,14 @@
           <w:b/>
           <w:sz w:val="26"/>
         </w:rPr>
-        <w:t>The length check.</w:t>
+        <w:t>The length check</w:t>
       </w:r>
       <w:r>
         <w:rPr>
           <w:rFonts w:ascii="Times New Roman" w:hAnsi="Times New Roman" w:eastAsia="Times New Roman"/>
           <w:sz w:val="26"/>
         </w:rPr>
-        <w:t xml:space="preserve"> Does every pathway's total node count stay within the target range we set for that course, regardless of tier?</w:t>
+        <w:t>, for the budget-stays-the-same rule. Does every pathway's total node count stay within the target range we set for that course, regardless of tier?</w:t>
       </w:r>
     </w:p>
     <w:p>

</xml_diff>